<commit_message>
Update README diagrams and release appendix
</commit_message>
<xml_diff>
--- a/开题报告附加材料release.docx
+++ b/开题报告附加材料release.docx
@@ -194,27 +194,13 @@
         <w:rPr>
           <w:lang w:eastAsia="zh-CN"/>
         </w:rPr>
-        <w:t xml:space="preserve"> </w:t>
-      </w:r>
-      <w:proofErr w:type="gramStart"/>
-      <w:r>
-        <w:rPr>
-          <w:lang w:eastAsia="zh-CN"/>
-        </w:rPr>
-        <w:t xml:space="preserve">1  </w:t>
-      </w:r>
-      <w:r>
-        <w:rPr>
-          <w:lang w:eastAsia="zh-CN"/>
-        </w:rPr>
-        <w:t>课程页将算法动画</w:t>
-      </w:r>
-      <w:proofErr w:type="gramEnd"/>
-      <w:r>
-        <w:rPr>
-          <w:lang w:eastAsia="zh-CN"/>
-        </w:rPr>
-        <w:t>、理解路径、</w:t>
+        <w:t xml:space="preserve"> 1  </w:t>
+      </w:r>
+      <w:r>
+        <w:rPr>
+          <w:lang w:eastAsia="zh-CN"/>
+        </w:rPr>
+        <w:t>课程页将算法动画、理解路径、</w:t>
       </w:r>
       <w:r>
         <w:rPr>
@@ -1346,6 +1332,7 @@
     </w:p>
     <w:p>
       <w:pPr>
+        <w:keepNext/>
         <w:spacing w:before="80" w:after="0"/>
         <w:jc w:val="center"/>
       </w:pPr>
@@ -1355,9 +1342,9 @@
         </w:rPr>
         <w:drawing>
           <wp:inline distT="0" distB="0" distL="0" distR="0" wp14:anchorId="6F83AEB1" wp14:editId="29D1AD98">
-            <wp:extent cx="5943600" cy="2047240"/>
+            <wp:extent cx="5943600" cy="3727207"/>
             <wp:effectExtent l="0" t="0" r="0" b="0"/>
-            <wp:docPr id="2" name="Picture 2" descr="算法学习闭环图" title="算法学习闭环图"/>
+            <wp:docPr id="2" name="Picture 2" descr="动画理解、代码映射、在线练习、即时判题、分层反馈与教师诊断组成的可视化编程学习闭环" title="动画理解、代码映射、在线练习、即时判题、分层反馈与教师诊断组成的可视化编程学习闭环"/>
             <wp:cNvGraphicFramePr>
               <a:graphicFrameLocks xmlns:a="http://schemas.openxmlformats.org/drawingml/2006/main" noChangeAspect="1"/>
             </wp:cNvGraphicFramePr>
@@ -1369,7 +1356,7 @@
                     <pic:cNvPicPr/>
                   </pic:nvPicPr>
                   <pic:blipFill>
-                    <a:blip r:embed="rId20"/>
+                    <a:blip r:embed="rId9"/>
                     <a:stretch>
                       <a:fillRect/>
                     </a:stretch>
@@ -1377,7 +1364,7 @@
                   <pic:spPr>
                     <a:xfrm>
                       <a:off x="0" y="0"/>
-                      <a:ext cx="5943600" cy="2047240"/>
+                      <a:ext cx="5943600" cy="3727207"/>
                     </a:xfrm>
                     <a:prstGeom prst="rect">
                       <a:avLst/>
@@ -1393,84 +1380,125 @@
     <w:p>
       <w:pPr>
         <w:pStyle w:val="af7"/>
-        <w:rPr>
-          <w:lang w:eastAsia="zh-CN"/>
-        </w:rPr>
-      </w:pPr>
-      <w:r>
-        <w:rPr>
+        <w:keepLines/>
+        <w:spacing w:after="80"/>
+        <w:rPr>
+          <w:lang w:eastAsia="zh-CN"/>
+        </w:rPr>
+      </w:pPr>
+      <w:r>
+        <w:rPr>
+          <w:rFonts w:eastAsia="宋体"/>
+          <w:b w:val="0"/>
+          <w:color w:val="52606D"/>
           <w:lang w:eastAsia="zh-CN"/>
         </w:rPr>
         <w:t>图</w:t>
       </w:r>
       <w:r>
         <w:rPr>
+          <w:rFonts w:eastAsia="宋体"/>
+          <w:b w:val="0"/>
+          <w:color w:val="52606D"/>
           <w:lang w:eastAsia="zh-CN"/>
         </w:rPr>
         <w:t xml:space="preserve"> 2  </w:t>
       </w:r>
       <w:r>
         <w:rPr>
+          <w:rFonts w:eastAsia="宋体"/>
+          <w:b w:val="0"/>
+          <w:color w:val="52606D"/>
           <w:lang w:eastAsia="zh-CN"/>
         </w:rPr>
         <w:t>动画理解</w:t>
       </w:r>
       <w:r>
         <w:rPr>
+          <w:rFonts w:eastAsia="宋体"/>
+          <w:b w:val="0"/>
+          <w:color w:val="52606D"/>
           <w:lang w:eastAsia="zh-CN"/>
         </w:rPr>
         <w:t>—</w:t>
       </w:r>
       <w:r>
         <w:rPr>
+          <w:rFonts w:eastAsia="宋体"/>
+          <w:b w:val="0"/>
+          <w:color w:val="52606D"/>
           <w:lang w:eastAsia="zh-CN"/>
         </w:rPr>
         <w:t>代码映射</w:t>
       </w:r>
       <w:r>
         <w:rPr>
+          <w:rFonts w:eastAsia="宋体"/>
+          <w:b w:val="0"/>
+          <w:color w:val="52606D"/>
           <w:lang w:eastAsia="zh-CN"/>
         </w:rPr>
         <w:t>—</w:t>
       </w:r>
       <w:r>
         <w:rPr>
+          <w:rFonts w:eastAsia="宋体"/>
+          <w:b w:val="0"/>
+          <w:color w:val="52606D"/>
           <w:lang w:eastAsia="zh-CN"/>
         </w:rPr>
         <w:t>在线练习</w:t>
       </w:r>
       <w:r>
         <w:rPr>
+          <w:rFonts w:eastAsia="宋体"/>
+          <w:b w:val="0"/>
+          <w:color w:val="52606D"/>
           <w:lang w:eastAsia="zh-CN"/>
         </w:rPr>
         <w:t>—</w:t>
       </w:r>
       <w:r>
         <w:rPr>
+          <w:rFonts w:eastAsia="宋体"/>
+          <w:b w:val="0"/>
+          <w:color w:val="52606D"/>
           <w:lang w:eastAsia="zh-CN"/>
         </w:rPr>
         <w:t>即时判题</w:t>
       </w:r>
       <w:r>
         <w:rPr>
+          <w:rFonts w:eastAsia="宋体"/>
+          <w:b w:val="0"/>
+          <w:color w:val="52606D"/>
           <w:lang w:eastAsia="zh-CN"/>
         </w:rPr>
         <w:t>—</w:t>
       </w:r>
       <w:r>
         <w:rPr>
+          <w:rFonts w:eastAsia="宋体"/>
+          <w:b w:val="0"/>
+          <w:color w:val="52606D"/>
           <w:lang w:eastAsia="zh-CN"/>
         </w:rPr>
         <w:t>分层反馈</w:t>
       </w:r>
       <w:r>
         <w:rPr>
+          <w:rFonts w:eastAsia="宋体"/>
+          <w:b w:val="0"/>
+          <w:color w:val="52606D"/>
           <w:lang w:eastAsia="zh-CN"/>
         </w:rPr>
         <w:t>—</w:t>
       </w:r>
       <w:r>
         <w:rPr>
+          <w:rFonts w:eastAsia="宋体"/>
+          <w:b w:val="0"/>
+          <w:color w:val="52606D"/>
           <w:lang w:eastAsia="zh-CN"/>
         </w:rPr>
         <w:t>教师诊断</w:t>
@@ -1478,120 +1506,246 @@
     </w:p>
     <w:p>
       <w:pPr>
-        <w:pStyle w:val="2"/>
-        <w:rPr>
-          <w:lang w:eastAsia="zh-CN"/>
-        </w:rPr>
-      </w:pPr>
-      <w:r>
-        <w:rPr>
-          <w:lang w:eastAsia="zh-CN"/>
-        </w:rPr>
-        <w:t>创新</w:t>
-      </w:r>
-      <w:r>
-        <w:rPr>
-          <w:lang w:eastAsia="zh-CN"/>
-        </w:rPr>
-        <w:t xml:space="preserve"> 1</w:t>
-      </w:r>
-      <w:r>
-        <w:rPr>
-          <w:lang w:eastAsia="zh-CN"/>
-        </w:rPr>
-        <w:t>｜动画不是终点，而是代码理解的入口。</w:t>
+        <w:keepLines/>
+        <w:spacing w:line="269" w:lineRule="auto"/>
+        <w:rPr>
+          <w:lang w:eastAsia="zh-CN"/>
+        </w:rPr>
+      </w:pPr>
+      <w:r>
+        <w:rPr>
+          <w:rFonts w:eastAsia="宋体"/>
+          <w:color w:val="52606D"/>
+          <w:sz w:val="18"/>
+          <w:lang w:eastAsia="zh-CN"/>
+        </w:rPr>
+        <w:t>系统以统一知识映射为核心，将动画理解、代码映射、在线练习、即时判题、分层反馈与教师诊断六个环节贯通。学习者通过程序状态、指针和调用栈等可视化内容理解运行过程，并将动画变化与代码变量及执行步骤同步对应；在线编程与自动判题进一步生成测试结果和错误类型，系统据此提供差异化提示、题解与错题整理。教师端汇总学习数据，识别知识薄弱点并形成教学建议。学习数据持续回流，用于内容迭代和下一轮教学，从而构成</w:t>
+      </w:r>
+      <w:r>
+        <w:rPr>
+          <w:rFonts w:eastAsia="宋体"/>
+          <w:color w:val="52606D"/>
+          <w:sz w:val="18"/>
+          <w:lang w:eastAsia="zh-CN"/>
+        </w:rPr>
+        <w:t>“</w:t>
+      </w:r>
+      <w:r>
+        <w:rPr>
+          <w:rFonts w:eastAsia="宋体"/>
+          <w:color w:val="52606D"/>
+          <w:sz w:val="18"/>
+          <w:lang w:eastAsia="zh-CN"/>
+        </w:rPr>
+        <w:t>理解</w:t>
+      </w:r>
+      <w:r>
+        <w:rPr>
+          <w:rFonts w:eastAsia="宋体"/>
+          <w:color w:val="52606D"/>
+          <w:sz w:val="18"/>
+          <w:lang w:eastAsia="zh-CN"/>
+        </w:rPr>
+        <w:t>—</w:t>
+      </w:r>
+      <w:r>
+        <w:rPr>
+          <w:rFonts w:eastAsia="宋体"/>
+          <w:color w:val="52606D"/>
+          <w:sz w:val="18"/>
+          <w:lang w:eastAsia="zh-CN"/>
+        </w:rPr>
+        <w:t>练习</w:t>
+      </w:r>
+      <w:r>
+        <w:rPr>
+          <w:rFonts w:eastAsia="宋体"/>
+          <w:color w:val="52606D"/>
+          <w:sz w:val="18"/>
+          <w:lang w:eastAsia="zh-CN"/>
+        </w:rPr>
+        <w:t>—</w:t>
+      </w:r>
+      <w:r>
+        <w:rPr>
+          <w:rFonts w:eastAsia="宋体"/>
+          <w:color w:val="52606D"/>
+          <w:sz w:val="18"/>
+          <w:lang w:eastAsia="zh-CN"/>
+        </w:rPr>
+        <w:t>反馈</w:t>
+      </w:r>
+      <w:r>
+        <w:rPr>
+          <w:rFonts w:eastAsia="宋体"/>
+          <w:color w:val="52606D"/>
+          <w:sz w:val="18"/>
+          <w:lang w:eastAsia="zh-CN"/>
+        </w:rPr>
+        <w:t>—</w:t>
+      </w:r>
+      <w:r>
+        <w:rPr>
+          <w:rFonts w:eastAsia="宋体"/>
+          <w:color w:val="52606D"/>
+          <w:sz w:val="18"/>
+          <w:lang w:eastAsia="zh-CN"/>
+        </w:rPr>
+        <w:t>诊断</w:t>
+      </w:r>
+      <w:r>
+        <w:rPr>
+          <w:rFonts w:eastAsia="宋体"/>
+          <w:color w:val="52606D"/>
+          <w:sz w:val="18"/>
+          <w:lang w:eastAsia="zh-CN"/>
+        </w:rPr>
+        <w:t>—</w:t>
+      </w:r>
+      <w:r>
+        <w:rPr>
+          <w:rFonts w:eastAsia="宋体"/>
+          <w:color w:val="52606D"/>
+          <w:sz w:val="18"/>
+          <w:lang w:eastAsia="zh-CN"/>
+        </w:rPr>
+        <w:t>改进</w:t>
+      </w:r>
+      <w:r>
+        <w:rPr>
+          <w:rFonts w:eastAsia="宋体"/>
+          <w:color w:val="52606D"/>
+          <w:sz w:val="18"/>
+          <w:lang w:eastAsia="zh-CN"/>
+        </w:rPr>
+        <w:t>”</w:t>
+      </w:r>
+      <w:r>
+        <w:rPr>
+          <w:rFonts w:eastAsia="宋体"/>
+          <w:color w:val="52606D"/>
+          <w:sz w:val="18"/>
+          <w:lang w:eastAsia="zh-CN"/>
+        </w:rPr>
+        <w:t>的完整闭环。</w:t>
       </w:r>
     </w:p>
     <w:p>
       <w:pPr>
-        <w:rPr>
-          <w:lang w:eastAsia="zh-CN"/>
-        </w:rPr>
-      </w:pPr>
-      <w:r>
-        <w:rPr>
-          <w:lang w:eastAsia="zh-CN"/>
-        </w:rPr>
-        <w:t>动画中的数组格、指针、调用栈、状态转移与递归树继续映射到</w:t>
-      </w:r>
-      <w:r>
-        <w:rPr>
-          <w:lang w:eastAsia="zh-CN"/>
-        </w:rPr>
-        <w:t xml:space="preserve"> C++ </w:t>
-      </w:r>
-      <w:r>
-        <w:rPr>
-          <w:lang w:eastAsia="zh-CN"/>
-        </w:rPr>
-        <w:t>变量、循环边界与测试点，减少</w:t>
-      </w:r>
-      <w:r>
-        <w:rPr>
-          <w:lang w:eastAsia="zh-CN"/>
-        </w:rPr>
-        <w:t>“</w:t>
-      </w:r>
-      <w:r>
-        <w:rPr>
-          <w:lang w:eastAsia="zh-CN"/>
-        </w:rPr>
-        <w:t>动画看懂了，代码仍不会写</w:t>
-      </w:r>
-      <w:r>
-        <w:rPr>
-          <w:lang w:eastAsia="zh-CN"/>
-        </w:rPr>
-        <w:t>”</w:t>
-      </w:r>
-      <w:r>
-        <w:rPr>
-          <w:lang w:eastAsia="zh-CN"/>
-        </w:rPr>
-        <w:t>的断层。</w:t>
+        <w:pStyle w:val="2"/>
+        <w:rPr>
+          <w:lang w:eastAsia="zh-CN"/>
+        </w:rPr>
+      </w:pPr>
+      <w:r>
+        <w:rPr>
+          <w:lang w:eastAsia="zh-CN"/>
+        </w:rPr>
+        <w:t>创新</w:t>
+      </w:r>
+      <w:r>
+        <w:rPr>
+          <w:lang w:eastAsia="zh-CN"/>
+        </w:rPr>
+        <w:t xml:space="preserve"> 1</w:t>
+      </w:r>
+      <w:r>
+        <w:rPr>
+          <w:lang w:eastAsia="zh-CN"/>
+        </w:rPr>
+        <w:t>｜动画不是终点，而是代码理解的入口。</w:t>
       </w:r>
     </w:p>
     <w:p>
       <w:pPr>
-        <w:pStyle w:val="2"/>
-        <w:rPr>
-          <w:lang w:eastAsia="zh-CN"/>
-        </w:rPr>
-      </w:pPr>
-      <w:r>
-        <w:rPr>
-          <w:lang w:eastAsia="zh-CN"/>
-        </w:rPr>
-        <w:t>创新</w:t>
-      </w:r>
-      <w:r>
-        <w:rPr>
-          <w:lang w:eastAsia="zh-CN"/>
-        </w:rPr>
-        <w:t xml:space="preserve"> 2</w:t>
-      </w:r>
-      <w:r>
-        <w:rPr>
-          <w:lang w:eastAsia="zh-CN"/>
-        </w:rPr>
-        <w:t>｜分层反馈替代直接给答案。</w:t>
+        <w:rPr>
+          <w:lang w:eastAsia="zh-CN"/>
+        </w:rPr>
+      </w:pPr>
+      <w:r>
+        <w:rPr>
+          <w:lang w:eastAsia="zh-CN"/>
+        </w:rPr>
+        <w:t>动画中的数组格、指针、调用栈、状态转移与递归树继续映射到</w:t>
+      </w:r>
+      <w:r>
+        <w:rPr>
+          <w:lang w:eastAsia="zh-CN"/>
+        </w:rPr>
+        <w:t xml:space="preserve"> C++ </w:t>
+      </w:r>
+      <w:r>
+        <w:rPr>
+          <w:lang w:eastAsia="zh-CN"/>
+        </w:rPr>
+        <w:t>变量、循环边界与测试点，减少</w:t>
+      </w:r>
+      <w:r>
+        <w:rPr>
+          <w:lang w:eastAsia="zh-CN"/>
+        </w:rPr>
+        <w:t>“</w:t>
+      </w:r>
+      <w:r>
+        <w:rPr>
+          <w:lang w:eastAsia="zh-CN"/>
+        </w:rPr>
+        <w:t>动画看懂了，代码仍不会写</w:t>
+      </w:r>
+      <w:r>
+        <w:rPr>
+          <w:lang w:eastAsia="zh-CN"/>
+        </w:rPr>
+        <w:t>”</w:t>
+      </w:r>
+      <w:r>
+        <w:rPr>
+          <w:lang w:eastAsia="zh-CN"/>
+        </w:rPr>
+        <w:t>的断层。</w:t>
       </w:r>
     </w:p>
     <w:p>
       <w:pPr>
-        <w:rPr>
-          <w:lang w:eastAsia="zh-CN"/>
-        </w:rPr>
-      </w:pPr>
-      <w:r>
-        <w:rPr>
-          <w:lang w:eastAsia="zh-CN"/>
-        </w:rPr>
-        <w:t>练习先提示思路，再提示关键变量与边界，最后才进入核心实现；同时提供题解要点与常见错误，为青少年提供适度支架。</w:t>
+        <w:pStyle w:val="2"/>
+        <w:rPr>
+          <w:lang w:eastAsia="zh-CN"/>
+        </w:rPr>
+      </w:pPr>
+      <w:r>
+        <w:rPr>
+          <w:lang w:eastAsia="zh-CN"/>
+        </w:rPr>
+        <w:t>创新</w:t>
+      </w:r>
+      <w:r>
+        <w:rPr>
+          <w:lang w:eastAsia="zh-CN"/>
+        </w:rPr>
+        <w:t xml:space="preserve"> 2</w:t>
+      </w:r>
+      <w:r>
+        <w:rPr>
+          <w:lang w:eastAsia="zh-CN"/>
+        </w:rPr>
+        <w:t>｜分层反馈替代直接给答案。</w:t>
       </w:r>
     </w:p>
     <w:p>
       <w:pPr>
+        <w:rPr>
+          <w:lang w:eastAsia="zh-CN"/>
+        </w:rPr>
+      </w:pPr>
+      <w:r>
+        <w:rPr>
+          <w:lang w:eastAsia="zh-CN"/>
+        </w:rPr>
+        <w:t>练习先提示思路，再提示关键变量与边界，最后才进入核心实现；同时提供题解要点与常见错误，为青少年提供适度支架。</w:t>
+      </w:r>
+    </w:p>
+    <w:p>
+      <w:pPr>
         <w:pStyle w:val="2"/>
         <w:rPr>
           <w:lang w:eastAsia="zh-CN"/>
@@ -1601,6 +1755,7 @@
         <w:rPr>
           <w:lang w:eastAsia="zh-CN"/>
         </w:rPr>
+        <w:lastRenderedPageBreak/>
         <w:t>创新</w:t>
       </w:r>
       <w:r>
@@ -1761,7 +1916,6 @@
         <w:rPr>
           <w:lang w:eastAsia="zh-CN"/>
         </w:rPr>
-        <w:lastRenderedPageBreak/>
         <w:br w:type="page"/>
       </w:r>
     </w:p>
@@ -1782,6 +1936,7 @@
     </w:p>
     <w:p>
       <w:pPr>
+        <w:keepNext/>
         <w:spacing w:before="80" w:after="0"/>
         <w:jc w:val="center"/>
       </w:pPr>
@@ -1791,9 +1946,9 @@
         </w:rPr>
         <w:drawing>
           <wp:inline distT="0" distB="0" distL="0" distR="0" wp14:anchorId="6BFD6C45" wp14:editId="742F7AEA">
-            <wp:extent cx="5943600" cy="2476500"/>
+            <wp:extent cx="5943600" cy="4205565"/>
             <wp:effectExtent l="0" t="0" r="0" b="0"/>
-            <wp:docPr id="3" name="Picture 3" descr="系统四层架构图" title="系统四层架构图"/>
+            <wp:docPr id="3" name="Picture 3" descr="青少年 C++ 算法可视化教学系统学习交互、课程内容、服务判题与数据反馈四层总体架构" title="青少年 C++ 算法可视化教学系统学习交互、课程内容、服务判题与数据反馈四层总体架构"/>
             <wp:cNvGraphicFramePr>
               <a:graphicFrameLocks xmlns:a="http://schemas.openxmlformats.org/drawingml/2006/main" noChangeAspect="1"/>
             </wp:cNvGraphicFramePr>
@@ -1813,7 +1968,7 @@
                   <pic:spPr>
                     <a:xfrm>
                       <a:off x="0" y="0"/>
-                      <a:ext cx="5943600" cy="2476500"/>
+                      <a:ext cx="5943600" cy="4205565"/>
                     </a:xfrm>
                     <a:prstGeom prst="rect">
                       <a:avLst/>
@@ -1829,27 +1984,56 @@
     <w:p>
       <w:pPr>
         <w:pStyle w:val="af7"/>
-        <w:rPr>
-          <w:lang w:eastAsia="zh-CN"/>
-        </w:rPr>
-      </w:pPr>
-      <w:r>
-        <w:rPr>
+        <w:keepLines/>
+        <w:spacing w:after="80"/>
+        <w:rPr>
+          <w:lang w:eastAsia="zh-CN"/>
+        </w:rPr>
+      </w:pPr>
+      <w:r>
+        <w:rPr>
+          <w:rFonts w:eastAsia="宋体"/>
+          <w:b w:val="0"/>
+          <w:color w:val="52606D"/>
           <w:lang w:eastAsia="zh-CN"/>
         </w:rPr>
         <w:t>图</w:t>
       </w:r>
       <w:r>
         <w:rPr>
+          <w:rFonts w:eastAsia="宋体"/>
+          <w:b w:val="0"/>
+          <w:color w:val="52606D"/>
           <w:lang w:eastAsia="zh-CN"/>
         </w:rPr>
         <w:t xml:space="preserve"> 3  </w:t>
       </w:r>
       <w:r>
         <w:rPr>
+          <w:rFonts w:eastAsia="宋体"/>
+          <w:b w:val="0"/>
+          <w:color w:val="52606D"/>
           <w:lang w:eastAsia="zh-CN"/>
         </w:rPr>
         <w:t>学习交互层、课程内容层、服务判题层与数据反馈层协同</w:t>
+      </w:r>
+    </w:p>
+    <w:p>
+      <w:pPr>
+        <w:keepLines/>
+        <w:spacing w:line="269" w:lineRule="auto"/>
+        <w:rPr>
+          <w:lang w:eastAsia="zh-CN"/>
+        </w:rPr>
+      </w:pPr>
+      <w:r>
+        <w:rPr>
+          <w:rFonts w:eastAsia="宋体"/>
+          <w:color w:val="52606D"/>
+          <w:sz w:val="18"/>
+          <w:lang w:eastAsia="zh-CN"/>
+        </w:rPr>
+        <w:t>系统由学习交互层、课程内容层、服务与判题层和数据反馈层组成，分别负责前端学习体验、课程资源组织、在线代码评测与运行环境适配，以及学习数据统计与教学反馈。各层通过模块化接口连接，使课程内容、判题服务和平台接入相互解耦并可独立演进；判题结果与统计分析进一步回流至学习交互层，用于优化学习体验和教学策略。</w:t>
       </w:r>
     </w:p>
     <w:p>
@@ -2025,6 +2209,7 @@
         <w:rPr>
           <w:lang w:eastAsia="zh-CN"/>
         </w:rPr>
+        <w:lastRenderedPageBreak/>
         <w:t>方案深度佐证</w:t>
       </w:r>
     </w:p>

</xml_diff>